<commit_message>
Update resume to Applied AI & Software Engineer and regenerate single-page PDF
</commit_message>
<xml_diff>
--- a/public/assets/Henry_Fadeni_Software_AI_Engineer_Resume.docx
+++ b/public/assets/Henry_Fadeni_Software_AI_Engineer_Resume.docx
@@ -27,7 +27,7 @@
           <w:color w:val="2563EB"/>
           <w:sz w:val="17"/>
         </w:rPr>
-        <w:t>SOFTWARE &amp; AI ENGINEER | LLM SYSTEMS • RAG &amp; AGENT WORKFLOWS • DISTRIBUTED BACKENDS</w:t>
+        <w:t>APPLIED AI &amp; SOFTWARE ENGINEER | LLM SYSTEMS • RAG &amp; AGENT WORKFLOWS • DISTRIBUTED BACKENDS</w:t>
       </w:r>
     </w:p>
     <w:p>
@@ -76,7 +76,7 @@
         <w:rPr>
           <w:sz w:val="16"/>
         </w:rPr>
-        <w:t>Software &amp; AI Engineer with an Electrical &amp; Electronics Engineering foundation, specializing in production-grade LLM systems, evaluated RAG architectures, autonomous agent workflows, and high-throughput distributed backends. Experienced in building deterministic guardrails, human-in-the-loop controls, automated evaluation suites, and observable asynchronous backend pipelines. Proven track record of shipping end-to-end applications from distributed backend architecture to polished user interfaces.</w:t>
+        <w:t>Applied AI &amp; Software Engineer with an Electrical &amp; Electronics Engineering foundation, specializing in production-grade LLM systems, evaluated RAG architectures, autonomous agent workflows, and high-throughput asynchronous backends. Experienced in building deterministic guardrails, human-in-the-loop controls, automated evaluation suites, and observable asynchronous backend pipelines. Proven track record of shipping end-to-end applications from distributed backend architecture to polished user interfaces.</w:t>
       </w:r>
     </w:p>
     <w:p>
@@ -169,7 +169,7 @@
         <w:rPr>
           <w:sz w:val="16"/>
         </w:rPr>
-        <w:t>React, Next.js, Responsive Design, State Management, Interactive Data Dashboards</w:t>
+        <w:t>React, Next.js, State Management, Interactive Data Dashboards</w:t>
       </w:r>
     </w:p>
     <w:p>
@@ -193,6 +193,25 @@
     </w:p>
     <w:p>
       <w:pPr>
+        <w:spacing w:before="0" w:after="30" w:line="259" w:lineRule="auto"/>
+      </w:pPr>
+      <w:r>
+        <w:rPr>
+          <w:b/>
+          <w:color w:val="1E293B"/>
+          <w:sz w:val="16"/>
+        </w:rPr>
+        <w:t xml:space="preserve">Automation: </w:t>
+      </w:r>
+      <w:r>
+        <w:rPr>
+          <w:sz w:val="16"/>
+        </w:rPr>
+        <w:t>n8n (self-hosted workflows, webhook orchestration, custom code nodes), event-driven pipelines, scheduled ETL, apps integration</w:t>
+      </w:r>
+    </w:p>
+    <w:p>
+      <w:pPr>
         <w:keepNext/>
         <w:spacing w:before="190" w:after="50"/>
         <w:pBdr>
@@ -205,7 +224,7 @@
           <w:color w:val="0F172A"/>
           <w:sz w:val="19"/>
         </w:rPr>
-        <w:t>SELECTED AI &amp; BACKEND PROJECTS</w:t>
+        <w:t>APPLIED AI &amp; BACKEND PROJECTS</w:t>
       </w:r>
     </w:p>
     <w:tbl>
@@ -216,8 +235,8 @@
         <w:tblLook w:firstColumn="1" w:firstRow="1" w:lastColumn="0" w:lastRow="0" w:noHBand="0" w:noVBand="1" w:val="04A0"/>
       </w:tblPr>
       <w:tblGrid>
-        <w:gridCol w:w="8208"/>
-        <w:gridCol w:w="2592"/>
+        <w:gridCol w:w="8352"/>
+        <w:gridCol w:w="2448"/>
       </w:tblGrid>
       <w:tr>
         <w:tc>
@@ -240,7 +259,7 @@
                 <w:color w:val="0F172A"/>
                 <w:sz w:val="17"/>
               </w:rPr>
-              <w:t>Retrieval-Augmented Analytics Dashboard (Text-to-SQL)</w:t>
+              <w:t>Retrieval-Augmented Analytics Workspace (Text-to-SQL)</w:t>
             </w:r>
             <w:r>
               <w:rPr>
@@ -290,7 +309,7 @@
           <w:color w:val="334155"/>
           <w:sz w:val="16"/>
         </w:rPr>
-        <w:t>Architected a natural-language to SQL analytics workspace executing sandboxed, read-only analytical queries against DuckDB with streamed SSE explanations and dynamic charts.</w:t>
+        <w:t>Natural-language analytics interface executing sandboxed, read-only analytical queries against DuckDB with streamed SSE explanations and dynamic charts.</w:t>
       </w:r>
     </w:p>
     <w:p>
@@ -318,7 +337,7 @@
           <w:color w:val="334155"/>
           <w:sz w:val="16"/>
         </w:rPr>
-        <w:t>Engineered an automated evaluation harness across an 80-pair Golden Set (adapted from Spider), achieving 96% SQL validity, 74% execution accuracy, 61% failure self-correction, and ~4.2s p95 latency.</w:t>
+        <w:t>Automated evaluation harness across an 80-pair Golden Set (adapted from Spider), achieving 96% SQL validity, 74% execution accuracy, 61% failure self-correction, and ~4.2s p95 latency.</w:t>
       </w:r>
     </w:p>
     <w:tbl>
@@ -329,8 +348,8 @@
         <w:tblLook w:firstColumn="1" w:firstRow="1" w:lastColumn="0" w:lastRow="0" w:noHBand="0" w:noVBand="1" w:val="04A0"/>
       </w:tblPr>
       <w:tblGrid>
-        <w:gridCol w:w="8208"/>
-        <w:gridCol w:w="2592"/>
+        <w:gridCol w:w="8352"/>
+        <w:gridCol w:w="2448"/>
       </w:tblGrid>
       <w:tr>
         <w:tc>
@@ -353,7 +372,7 @@
                 <w:color w:val="0F172A"/>
                 <w:sz w:val="17"/>
               </w:rPr>
-              <w:t>Autonomous AI Code Review Agent</w:t>
+              <w:t>Autonomous Code Review Agent (GitHub App)</w:t>
             </w:r>
             <w:r>
               <w:rPr>
@@ -362,6 +381,119 @@
                 <w:sz w:val="16"/>
               </w:rPr>
               <w:t xml:space="preserve"> | Python · FastAPI · LangGraph · Celery · Redis · Docker</w:t>
+            </w:r>
+          </w:p>
+        </w:tc>
+        <w:tc>
+          <w:tcPr>
+            <w:tcW w:type="dxa" w:w="5400"/>
+            <w:tcMar>
+              <w:top w:w="0" w:type="dxa"/>
+              <w:bottom w:w="0" w:type="dxa"/>
+              <w:left w:w="0" w:type="dxa"/>
+              <w:right w:w="0" w:type="dxa"/>
+            </w:tcMar>
+          </w:tcPr>
+          <w:p>
+            <w:pPr>
+              <w:spacing w:before="70" w:after="10"/>
+              <w:jc w:val="right"/>
+            </w:pPr>
+            <w:r>
+              <w:rPr>
+                <w:b/>
+                <w:color w:val="0F172A"/>
+                <w:sz w:val="16"/>
+              </w:rPr>
+              <w:t>2025</w:t>
+            </w:r>
+          </w:p>
+        </w:tc>
+      </w:tr>
+    </w:tbl>
+    <w:p>
+      <w:pPr>
+        <w:pStyle w:val="ListBullet"/>
+        <w:spacing w:before="0" w:after="24" w:line="259" w:lineRule="auto"/>
+        <w:ind w:left="259"/>
+      </w:pPr>
+      <w:r>
+        <w:rPr>
+          <w:color w:val="334155"/>
+          <w:sz w:val="16"/>
+        </w:rPr>
+        <w:t>Event-driven GitHub App agent that parses pull-request diffs, retrieves relevant file context, and publishes line-level inline reviews and commit statuses.</w:t>
+      </w:r>
+    </w:p>
+    <w:p>
+      <w:pPr>
+        <w:pStyle w:val="ListBullet"/>
+        <w:spacing w:before="0" w:after="24" w:line="259" w:lineRule="auto"/>
+        <w:ind w:left="259"/>
+      </w:pPr>
+      <w:r>
+        <w:rPr>
+          <w:color w:val="334155"/>
+          <w:sz w:val="16"/>
+        </w:rPr>
+        <w:t>Decoupled webhook intake from model inference using Celery workers for asynchronous job queuing, with HMAC-SHA256 webhook verification and Redis sliding-window rate limiting.</w:t>
+      </w:r>
+    </w:p>
+    <w:p>
+      <w:pPr>
+        <w:pStyle w:val="ListBullet"/>
+        <w:spacing w:before="0" w:after="24" w:line="259" w:lineRule="auto"/>
+        <w:ind w:left="259"/>
+      </w:pPr>
+      <w:r>
+        <w:rPr>
+          <w:color w:val="334155"/>
+          <w:sz w:val="16"/>
+        </w:rPr>
+        <w:t>Built a pluggable multi-provider LLM abstraction (OpenAI, Anthropic, Groq, Ollama) behind an 80% CI code coverage gate.</w:t>
+      </w:r>
+    </w:p>
+    <w:tbl>
+      <w:tblPr>
+        <w:tblW w:type="auto" w:w="0"/>
+        <w:jc w:val="center"/>
+        <w:tblLayout w:type="fixed"/>
+        <w:tblLook w:firstColumn="1" w:firstRow="1" w:lastColumn="0" w:lastRow="0" w:noHBand="0" w:noVBand="1" w:val="04A0"/>
+      </w:tblPr>
+      <w:tblGrid>
+        <w:gridCol w:w="8352"/>
+        <w:gridCol w:w="2448"/>
+      </w:tblGrid>
+      <w:tr>
+        <w:tc>
+          <w:tcPr>
+            <w:tcW w:type="dxa" w:w="5400"/>
+            <w:tcMar>
+              <w:top w:w="0" w:type="dxa"/>
+              <w:bottom w:w="0" w:type="dxa"/>
+              <w:left w:w="0" w:type="dxa"/>
+              <w:right w:w="0" w:type="dxa"/>
+            </w:tcMar>
+          </w:tcPr>
+          <w:p>
+            <w:pPr>
+              <w:spacing w:before="70" w:after="10"/>
+            </w:pPr>
+            <w:r>
+              <w:rPr>
+                <w:b/>
+                <w:color w:val="0F172A"/>
+                <w:sz w:val="17"/>
+              </w:rPr>
+              <w:t>Self-Healing Microservices Monitor (Autonomous SRE Agent)</w:t>
+            </w:r>
+            <w:r>
+              <w:rPr>
+                <w:i/>
+                <w:color w:val="475569"/>
+                <w:sz w:val="16"/>
+              </w:rPr>
+              <w:t xml:space="preserve"> | LangGraph · ChromaDB · Prometheus · Postgres · React</w:t>
             </w:r>
           </w:p>
         </w:tc>
@@ -403,7 +535,7 @@
           <w:color w:val="334155"/>
           <w:sz w:val="16"/>
         </w:rPr>
-        <w:t>Developed an event-driven GitHub App agent that parses pull-request diffs, retrieves relevant file context, and publishes line-level inline reviews and commit statuses.</w:t>
+        <w:t>Incident-response agent integrating Prometheus Alertmanager webhooks, LangGraph multi-step diagnosis, and ChromaDB vector runbook retrieval.</w:t>
       </w:r>
     </w:p>
     <w:p>
@@ -417,7 +549,7 @@
           <w:color w:val="334155"/>
           <w:sz w:val="16"/>
         </w:rPr>
-        <w:t>Implemented HMAC-SHA256 webhook verification, Redis sliding-window rate limiting, and asynchronous job queuing via Celery workers to decouple webhook intake from model inference.</w:t>
+        <w:t>Designed a 4-condition deterministic policy gate (confidence &gt;= 0.75, allowlisted low-risk actions, impact checks, human approval routing) preventing destructive runaway executions with PostgreSQL audit trails.</w:t>
       </w:r>
     </w:p>
     <w:p>
@@ -431,7 +563,7 @@
           <w:color w:val="334155"/>
           <w:sz w:val="16"/>
         </w:rPr>
-        <w:t>Built pluggable multi-provider LLM abstraction (OpenAI, Anthropic, Groq, Ollama), structured JSON validation, and an evaluation harness with an 80% CI code coverage gate.</w:t>
+        <w:t>Scored 100% action and policy correctness across simulated failure scenarios with a live React operator dashboard.</w:t>
       </w:r>
     </w:p>
     <w:tbl>
@@ -442,8 +574,8 @@
         <w:tblLook w:firstColumn="1" w:firstRow="1" w:lastColumn="0" w:lastRow="0" w:noHBand="0" w:noVBand="1" w:val="04A0"/>
       </w:tblPr>
       <w:tblGrid>
-        <w:gridCol w:w="8208"/>
-        <w:gridCol w:w="2592"/>
+        <w:gridCol w:w="8352"/>
+        <w:gridCol w:w="2448"/>
       </w:tblGrid>
       <w:tr>
         <w:tc>
@@ -466,120 +598,7 @@
                 <w:color w:val="0F172A"/>
                 <w:sz w:val="17"/>
               </w:rPr>
-              <w:t>Self-Healing Microservices Monitor (Autonomous SRE Agent)</w:t>
-            </w:r>
-            <w:r>
-              <w:rPr>
-                <w:i/>
-                <w:color w:val="475569"/>
-                <w:sz w:val="16"/>
-              </w:rPr>
-              <w:t xml:space="preserve"> | LangGraph · ChromaDB · Prometheus · Postgres</w:t>
-            </w:r>
-          </w:p>
-        </w:tc>
-        <w:tc>
-          <w:tcPr>
-            <w:tcW w:type="dxa" w:w="5400"/>
-            <w:tcMar>
-              <w:top w:w="0" w:type="dxa"/>
-              <w:bottom w:w="0" w:type="dxa"/>
-              <w:left w:w="0" w:type="dxa"/>
-              <w:right w:w="0" w:type="dxa"/>
-            </w:tcMar>
-          </w:tcPr>
-          <w:p>
-            <w:pPr>
-              <w:spacing w:before="70" w:after="10"/>
-              <w:jc w:val="right"/>
-            </w:pPr>
-            <w:r>
-              <w:rPr>
-                <w:b/>
-                <w:color w:val="0F172A"/>
-                <w:sz w:val="16"/>
-              </w:rPr>
-              <w:t>2026</w:t>
-            </w:r>
-          </w:p>
-        </w:tc>
-      </w:tr>
-    </w:tbl>
-    <w:p>
-      <w:pPr>
-        <w:pStyle w:val="ListBullet"/>
-        <w:spacing w:before="0" w:after="24" w:line="259" w:lineRule="auto"/>
-        <w:ind w:left="259"/>
-      </w:pPr>
-      <w:r>
-        <w:rPr>
-          <w:color w:val="334155"/>
-          <w:sz w:val="16"/>
-        </w:rPr>
-        <w:t>Built an incident-response agent integrating Prometheus Alertmanager webhooks, LangGraph multi-step diagnosis, and ChromaDB vector runbook retrieval.</w:t>
-      </w:r>
-    </w:p>
-    <w:p>
-      <w:pPr>
-        <w:pStyle w:val="ListBullet"/>
-        <w:spacing w:before="0" w:after="24" w:line="259" w:lineRule="auto"/>
-        <w:ind w:left="259"/>
-      </w:pPr>
-      <w:r>
-        <w:rPr>
-          <w:color w:val="334155"/>
-          <w:sz w:val="16"/>
-        </w:rPr>
-        <w:t>Engineered a 4-condition deterministic policy gate (confidence &gt;= 0.75, allowlisted low-risk actions, impact checks, human approval routing) preventing destructive runaway executions with PostgreSQL audit trails.</w:t>
-      </w:r>
-    </w:p>
-    <w:p>
-      <w:pPr>
-        <w:pStyle w:val="ListBullet"/>
-        <w:spacing w:before="0" w:after="24" w:line="259" w:lineRule="auto"/>
-        <w:ind w:left="259"/>
-      </w:pPr>
-      <w:r>
-        <w:rPr>
-          <w:color w:val="334155"/>
-          <w:sz w:val="16"/>
-        </w:rPr>
-        <w:t>Achieved 100% (4/4) action and policy correctness across simulated failure scenarios with a live React operator dashboard.</w:t>
-      </w:r>
-    </w:p>
-    <w:tbl>
-      <w:tblPr>
-        <w:tblW w:type="auto" w:w="0"/>
-        <w:jc w:val="center"/>
-        <w:tblLayout w:type="fixed"/>
-        <w:tblLook w:firstColumn="1" w:firstRow="1" w:lastColumn="0" w:lastRow="0" w:noHBand="0" w:noVBand="1" w:val="04A0"/>
-      </w:tblPr>
-      <w:tblGrid>
-        <w:gridCol w:w="8208"/>
-        <w:gridCol w:w="2592"/>
-      </w:tblGrid>
-      <w:tr>
-        <w:tc>
-          <w:tcPr>
-            <w:tcW w:type="dxa" w:w="5400"/>
-            <w:tcMar>
-              <w:top w:w="0" w:type="dxa"/>
-              <w:bottom w:w="0" w:type="dxa"/>
-              <w:left w:w="0" w:type="dxa"/>
-              <w:right w:w="0" w:type="dxa"/>
-            </w:tcMar>
-          </w:tcPr>
-          <w:p>
-            <w:pPr>
-              <w:spacing w:before="70" w:after="10"/>
-            </w:pPr>
-            <w:r>
-              <w:rPr>
-                <w:b/>
-                <w:color w:val="0F172A"/>
-                <w:sz w:val="17"/>
-              </w:rPr>
-              <w:t>Realtime Multi-Room Chat Backend</w:t>
+              <w:t>Distributed Realtime Chat Backend</w:t>
             </w:r>
             <w:r>
               <w:rPr>
@@ -629,7 +648,7 @@
           <w:color w:val="334155"/>
           <w:sz w:val="16"/>
         </w:rPr>
-        <w:t>Engineered a distributed multi-room WebSocket backend scaling across workers using reference-counted Redis Pub/Sub channels (one channel per active room).</w:t>
+        <w:t>Multi-room WebSocket backend scaling across workers using reference-counted Redis Pub/Sub channels (one channel per active room).</w:t>
       </w:r>
     </w:p>
     <w:p>
@@ -643,21 +662,7 @@
           <w:color w:val="334155"/>
           <w:sz w:val="16"/>
         </w:rPr>
-        <w:t>Implemented JWT authentication during WebSocket handshakes, Redis hash presence tracking with multi-device deduplication, and cursor-paginated message history (15 msgs/page).</w:t>
-      </w:r>
-    </w:p>
-    <w:p>
-      <w:pPr>
-        <w:pStyle w:val="ListBullet"/>
-        <w:spacing w:before="0" w:after="24" w:line="259" w:lineRule="auto"/>
-        <w:ind w:left="259"/>
-      </w:pPr>
-      <w:r>
-        <w:rPr>
-          <w:color w:val="334155"/>
-          <w:sz w:val="16"/>
-        </w:rPr>
-        <w:t>Authored cross-process integration test suites verifying synchronized multi-worker message delivery and connection fault isolation.</w:t>
+        <w:t>JWT authentication at handshake, Redis-hash presence tracking with multi-device deduplication, and cursor-paginated message history (15 msgs/page); verified by cross-process integration tests for multi-worker delivery and connection fault isolation.</w:t>
       </w:r>
     </w:p>
     <w:p>
@@ -674,7 +679,7 @@
           <w:color w:val="0F172A"/>
           <w:sz w:val="19"/>
         </w:rPr>
-        <w:t>PROFESSIONAL EXPERIENCE &amp; RESEARCH</w:t>
+        <w:t>EXPERIENCE</w:t>
       </w:r>
     </w:p>
     <w:tbl>
@@ -685,8 +690,8 @@
         <w:tblLook w:firstColumn="1" w:firstRow="1" w:lastColumn="0" w:lastRow="0" w:noHBand="0" w:noVBand="1" w:val="04A0"/>
       </w:tblPr>
       <w:tblGrid>
-        <w:gridCol w:w="8208"/>
-        <w:gridCol w:w="2592"/>
+        <w:gridCol w:w="8352"/>
+        <w:gridCol w:w="2448"/>
       </w:tblGrid>
       <w:tr>
         <w:tc>
@@ -709,7 +714,7 @@
                 <w:color w:val="0F172A"/>
                 <w:sz w:val="17"/>
               </w:rPr>
-              <w:t>Freelance Software &amp; AI Engineer</w:t>
+              <w:t>Freelance Applied AI &amp; Software Engineer</w:t>
             </w:r>
             <w:r>
               <w:rPr>
@@ -765,7 +770,7 @@
           <w:color w:val="334155"/>
           <w:sz w:val="16"/>
         </w:rPr>
-        <w:t>Designed and delivered production-grade AI systems, RAG workflows, agentic automation pipelines, and backend APIs for international clients and product builds.</w:t>
+        <w:t>Delivered LLM systems, RAG workflows, agentic automation pipelines, and backend APIs across three engagements: a Series A logistics SaaS (Germany), an e-commerce operator (Nigeria), and a recruitment agency (Netherlands). Named references available on request.</w:t>
       </w:r>
     </w:p>
     <w:p>
@@ -779,7 +784,7 @@
           <w:color w:val="334155"/>
           <w:sz w:val="16"/>
         </w:rPr>
-        <w:t>Implemented rigorous evaluation harnesses, safety guardrails, and deterministic tool-use boundaries across web, voice, and developer automation applications.</w:t>
+        <w:t>Automated lead qualification end-to-end with n8n and a classification agent, tripling qualified-lead volume (~45 → ~140/week) with no added headcount.</w:t>
       </w:r>
     </w:p>
     <w:tbl>
@@ -790,8 +795,8 @@
         <w:tblLook w:firstColumn="1" w:firstRow="1" w:lastColumn="0" w:lastRow="0" w:noHBand="0" w:noVBand="1" w:val="04A0"/>
       </w:tblPr>
       <w:tblGrid>
-        <w:gridCol w:w="8208"/>
-        <w:gridCol w:w="2592"/>
+        <w:gridCol w:w="8352"/>
+        <w:gridCol w:w="2448"/>
       </w:tblGrid>
       <w:tr>
         <w:tc>
@@ -895,8 +900,8 @@
         <w:tblLook w:firstColumn="1" w:firstRow="1" w:lastColumn="0" w:lastRow="0" w:noHBand="0" w:noVBand="1" w:val="04A0"/>
       </w:tblPr>
       <w:tblGrid>
-        <w:gridCol w:w="8208"/>
-        <w:gridCol w:w="2592"/>
+        <w:gridCol w:w="8352"/>
+        <w:gridCol w:w="2448"/>
       </w:tblGrid>
       <w:tr>
         <w:tc>
@@ -1006,7 +1011,7 @@
           <w:color w:val="0F172A"/>
           <w:sz w:val="19"/>
         </w:rPr>
-        <w:t>EDUCATION &amp; PROFESSIONAL DEVELOPMENT</w:t>
+        <w:t>EDUCATION</w:t>
       </w:r>
     </w:p>
     <w:tbl>
@@ -1017,8 +1022,8 @@
         <w:tblLook w:firstColumn="1" w:firstRow="1" w:lastColumn="0" w:lastRow="0" w:noHBand="0" w:noVBand="1" w:val="04A0"/>
       </w:tblPr>
       <w:tblGrid>
-        <w:gridCol w:w="8208"/>
-        <w:gridCol w:w="2592"/>
+        <w:gridCol w:w="8352"/>
+        <w:gridCol w:w="2448"/>
       </w:tblGrid>
       <w:tr>
         <w:tc>
@@ -1095,7 +1100,7 @@
           <w:b/>
           <w:sz w:val="16"/>
         </w:rPr>
-        <w:t xml:space="preserve">Specialized Training: </w:t>
+        <w:t xml:space="preserve">Additional Training: </w:t>
       </w:r>
       <w:r>
         <w:rPr>

</xml_diff>